<commit_message>
added notes to the word documents
</commit_message>
<xml_diff>
--- a/QAP3/QAP 3 Java SD16.docx
+++ b/QAP3/QAP 3 Java SD16.docx
@@ -901,11 +901,11 @@
           <w:rFonts w:ascii="Arial" w:hAnsi="Arial" w:cs="Arial"/>
           <w:i/>
           <w:iCs/>
-          <w:color w:val="000000" w:themeColor="text1"/>
+          <w:color w:val="70AD47" w:themeColor="accent6"/>
           <w:sz w:val="27"/>
           <w:szCs w:val="27"/>
         </w:rPr>
-        <w:t>(Please estimate per problem if possible)</w:t>
+        <w:t>more the required hours</w:t>
       </w:r>
     </w:p>
     <w:p>
@@ -930,8 +930,9 @@
           <w:sz w:val="27"/>
           <w:szCs w:val="27"/>
         </w:rPr>
-        <w:t>What online resources did you use?</w:t>
-      </w:r>
+        <w:t xml:space="preserve">What online resources did you </w:t>
+      </w:r>
+      <w:proofErr w:type="gramStart"/>
       <w:r>
         <w:rPr>
           <w:rFonts w:ascii="Arial" w:hAnsi="Arial" w:cs="Arial"/>
@@ -939,7 +940,7 @@
           <w:sz w:val="27"/>
           <w:szCs w:val="27"/>
         </w:rPr>
-        <w:br/>
+        <w:t>use?</w:t>
       </w:r>
       <w:r>
         <w:rPr>
@@ -950,7 +951,43 @@
           <w:sz w:val="27"/>
           <w:szCs w:val="27"/>
         </w:rPr>
-        <w:t>(e.g., Lectures, YouTube, Stack Overflow, etc.)</w:t>
+        <w:t>(</w:t>
+      </w:r>
+      <w:proofErr w:type="gramEnd"/>
+      <w:r>
+        <w:rPr>
+          <w:rFonts w:ascii="Arial" w:hAnsi="Arial" w:cs="Arial"/>
+          <w:i/>
+          <w:iCs/>
+          <w:color w:val="000000" w:themeColor="text1"/>
+          <w:sz w:val="27"/>
+          <w:szCs w:val="27"/>
+        </w:rPr>
+        <w:t>e.g., Lectures, YouTube, Stack Overflow, etc.)</w:t>
+      </w:r>
+    </w:p>
+    <w:p>
+      <w:pPr>
+        <w:pStyle w:val="NormalWeb"/>
+        <w:spacing w:before="120" w:beforeAutospacing="0" w:after="120" w:afterAutospacing="0"/>
+        <w:ind w:left="720"/>
+        <w:rPr>
+          <w:rFonts w:ascii="Arial" w:hAnsi="Arial" w:cs="Arial"/>
+          <w:color w:val="70AD47" w:themeColor="accent6"/>
+          <w:sz w:val="27"/>
+          <w:szCs w:val="27"/>
+        </w:rPr>
+      </w:pPr>
+      <w:r>
+        <w:rPr>
+          <w:rFonts w:ascii="Arial" w:hAnsi="Arial" w:cs="Arial"/>
+          <w:i/>
+          <w:iCs/>
+          <w:color w:val="70AD47" w:themeColor="accent6"/>
+          <w:sz w:val="27"/>
+          <w:szCs w:val="27"/>
+        </w:rPr>
+        <w:t>Yes, including online books</w:t>
       </w:r>
     </w:p>
     <w:p>
@@ -975,8 +1012,9 @@
           <w:sz w:val="27"/>
           <w:szCs w:val="27"/>
         </w:rPr>
-        <w:t>Did you get help from any classmates?</w:t>
-      </w:r>
+        <w:t xml:space="preserve">Did you get help from any </w:t>
+      </w:r>
+      <w:proofErr w:type="gramStart"/>
       <w:r>
         <w:rPr>
           <w:rFonts w:ascii="Arial" w:hAnsi="Arial" w:cs="Arial"/>
@@ -984,7 +1022,7 @@
           <w:sz w:val="27"/>
           <w:szCs w:val="27"/>
         </w:rPr>
-        <w:br/>
+        <w:t>classmates?</w:t>
       </w:r>
       <w:r>
         <w:rPr>
@@ -995,7 +1033,41 @@
           <w:sz w:val="27"/>
           <w:szCs w:val="27"/>
         </w:rPr>
-        <w:t>(If yes, provide names; they must be enrolled in your class)</w:t>
+        <w:t>(</w:t>
+      </w:r>
+      <w:proofErr w:type="gramEnd"/>
+      <w:r>
+        <w:rPr>
+          <w:rFonts w:ascii="Arial" w:hAnsi="Arial" w:cs="Arial"/>
+          <w:i/>
+          <w:iCs/>
+          <w:color w:val="000000" w:themeColor="text1"/>
+          <w:sz w:val="27"/>
+          <w:szCs w:val="27"/>
+        </w:rPr>
+        <w:t>If yes, provide names; they must be enrolled in your class)</w:t>
+      </w:r>
+    </w:p>
+    <w:p>
+      <w:pPr>
+        <w:pStyle w:val="NormalWeb"/>
+        <w:spacing w:before="120" w:beforeAutospacing="0" w:after="120" w:afterAutospacing="0"/>
+        <w:ind w:left="720"/>
+        <w:rPr>
+          <w:rFonts w:ascii="Arial" w:hAnsi="Arial" w:cs="Arial"/>
+          <w:color w:val="70AD47" w:themeColor="accent6"/>
+          <w:sz w:val="27"/>
+          <w:szCs w:val="27"/>
+        </w:rPr>
+      </w:pPr>
+      <w:r>
+        <w:rPr>
+          <w:rFonts w:ascii="Arial" w:hAnsi="Arial" w:cs="Arial"/>
+          <w:color w:val="70AD47" w:themeColor="accent6"/>
+          <w:sz w:val="27"/>
+          <w:szCs w:val="27"/>
+        </w:rPr>
+        <w:t>Yes, I ask Feras some questions</w:t>
       </w:r>
     </w:p>
     <w:p>
@@ -1020,8 +1092,9 @@
           <w:sz w:val="27"/>
           <w:szCs w:val="27"/>
         </w:rPr>
-        <w:t>Did you ask for help from an instructor?</w:t>
-      </w:r>
+        <w:t xml:space="preserve">Did you ask for help from an </w:t>
+      </w:r>
+      <w:proofErr w:type="gramStart"/>
       <w:r>
         <w:rPr>
           <w:rFonts w:ascii="Arial" w:hAnsi="Arial" w:cs="Arial"/>
@@ -1029,7 +1102,7 @@
           <w:sz w:val="27"/>
           <w:szCs w:val="27"/>
         </w:rPr>
-        <w:br/>
+        <w:t>instructor?</w:t>
       </w:r>
       <w:r>
         <w:rPr>
@@ -1040,7 +1113,41 @@
           <w:sz w:val="27"/>
           <w:szCs w:val="27"/>
         </w:rPr>
-        <w:t>(Mention the number of questions/help sessions)</w:t>
+        <w:t>(</w:t>
+      </w:r>
+      <w:proofErr w:type="gramEnd"/>
+      <w:r>
+        <w:rPr>
+          <w:rFonts w:ascii="Arial" w:hAnsi="Arial" w:cs="Arial"/>
+          <w:i/>
+          <w:iCs/>
+          <w:color w:val="000000" w:themeColor="text1"/>
+          <w:sz w:val="27"/>
+          <w:szCs w:val="27"/>
+        </w:rPr>
+        <w:t>Mention the number of questions/help sessions)</w:t>
+      </w:r>
+    </w:p>
+    <w:p>
+      <w:pPr>
+        <w:pStyle w:val="NormalWeb"/>
+        <w:spacing w:before="120" w:beforeAutospacing="0" w:after="120" w:afterAutospacing="0"/>
+        <w:ind w:left="720"/>
+        <w:rPr>
+          <w:rFonts w:ascii="Arial" w:hAnsi="Arial" w:cs="Arial"/>
+          <w:color w:val="70AD47" w:themeColor="accent6"/>
+          <w:sz w:val="27"/>
+          <w:szCs w:val="27"/>
+        </w:rPr>
+      </w:pPr>
+      <w:r>
+        <w:rPr>
+          <w:rFonts w:ascii="Arial" w:hAnsi="Arial" w:cs="Arial"/>
+          <w:color w:val="70AD47" w:themeColor="accent6"/>
+          <w:sz w:val="27"/>
+          <w:szCs w:val="27"/>
+        </w:rPr>
+        <w:t>No</w:t>
       </w:r>
     </w:p>
     <w:p>
@@ -1066,6 +1173,28 @@
           <w:szCs w:val="27"/>
         </w:rPr>
         <w:t>Rate the difficulty of each problem and your confidence in solving similar problems in the future.</w:t>
+      </w:r>
+    </w:p>
+    <w:p>
+      <w:pPr>
+        <w:pStyle w:val="NormalWeb"/>
+        <w:spacing w:before="120" w:beforeAutospacing="0" w:after="120" w:afterAutospacing="0"/>
+        <w:ind w:left="720"/>
+        <w:rPr>
+          <w:rFonts w:ascii="Arial" w:hAnsi="Arial" w:cs="Arial"/>
+          <w:color w:val="70AD47" w:themeColor="accent6"/>
+          <w:sz w:val="27"/>
+          <w:szCs w:val="27"/>
+        </w:rPr>
+      </w:pPr>
+      <w:r>
+        <w:rPr>
+          <w:rFonts w:ascii="Arial" w:hAnsi="Arial" w:cs="Arial"/>
+          <w:color w:val="70AD47" w:themeColor="accent6"/>
+          <w:sz w:val="27"/>
+          <w:szCs w:val="27"/>
+        </w:rPr>
+        <w:t>More to advance</w:t>
       </w:r>
     </w:p>
     <w:p>
@@ -6710,10 +6839,10 @@
             <v:path o:extrusionok="f" gradientshapeok="t" o:connecttype="rect"/>
             <o:lock v:ext="edit" aspectratio="t"/>
           </v:shapetype>
-          <v:shape id="_x0000_i1025" type="#_x0000_t75" style="width:7.5pt;height:16.3pt" o:ole="">
+          <v:shape id="_x0000_i1025" type="#_x0000_t75" style="width:7.45pt;height:16.3pt" o:ole="">
             <v:imagedata r:id="rId10" o:title=""/>
           </v:shape>
-          <o:OLEObject Type="Embed" ProgID="Equation.3" ShapeID="_x0000_i1025" DrawAspect="Content" ObjectID="_1846237195" r:id="rId11"/>
+          <o:OLEObject Type="Embed" ProgID="Equation.3" ShapeID="_x0000_i1025" DrawAspect="Content" ObjectID="_1846589858" r:id="rId11"/>
         </w:object>
       </w:r>
       <w:r>
@@ -7128,8 +7257,53 @@
           <w:sz w:val="24"/>
           <w:szCs w:val="24"/>
         </w:rPr>
+        <w:fldChar w:fldCharType="begin"/>
+      </w:r>
+      <w:r>
+        <w:rPr>
+          <w:rFonts w:ascii="Arial" w:hAnsi="Arial" w:cs="Arial"/>
+          <w:position w:val="-12"/>
+          <w:sz w:val="24"/>
+          <w:szCs w:val="24"/>
+        </w:rPr>
+        <w:instrText xml:space="preserve"> </w:instrText>
+      </w:r>
+      <w:r>
+        <w:rPr>
+          <w:rFonts w:ascii="Arial" w:hAnsi="Arial" w:cs="Arial"/>
+          <w:position w:val="-12"/>
+          <w:sz w:val="24"/>
+          <w:szCs w:val="24"/>
+        </w:rPr>
+        <w:instrText>INCLUDEPICTURE  "https://d.docs.live.net/b067b7b029f5ae2b/Documents/Keyin_SD/Semester 3/Keyin-S3-SD16-Java/Previous/Advanced Programming Java/Spring 22/ICS101/ics101-002/Hw2_001.gif" \* MERGEFORMATINET</w:instrText>
+      </w:r>
+      <w:r>
+        <w:rPr>
+          <w:rFonts w:ascii="Arial" w:hAnsi="Arial" w:cs="Arial"/>
+          <w:position w:val="-12"/>
+          <w:sz w:val="24"/>
+          <w:szCs w:val="24"/>
+        </w:rPr>
+        <w:instrText xml:space="preserve"> </w:instrText>
+      </w:r>
+      <w:r>
+        <w:rPr>
+          <w:rFonts w:ascii="Arial" w:hAnsi="Arial" w:cs="Arial"/>
+          <w:position w:val="-12"/>
+          <w:sz w:val="24"/>
+          <w:szCs w:val="24"/>
+        </w:rPr>
+        <w:fldChar w:fldCharType="separate"/>
+      </w:r>
+      <w:r>
+        <w:rPr>
+          <w:rFonts w:ascii="Arial" w:hAnsi="Arial" w:cs="Arial"/>
+          <w:position w:val="-12"/>
+          <w:sz w:val="24"/>
+          <w:szCs w:val="24"/>
+        </w:rPr>
         <w:pict w14:anchorId="783BB8A0">
-          <v:shape id="_x0000_i1026" type="#_x0000_t75" style="width:167.8pt;height:20.65pt">
+          <v:shape id="_x0000_i1026" type="#_x0000_t75" style="width:167.75pt;height:20.4pt">
             <v:imagedata r:id="rId12" r:href="rId13"/>
           </v:shape>
         </w:pict>
@@ -7269,6 +7443,15 @@
         </w:rPr>
         <w:fldChar w:fldCharType="end"/>
       </w:r>
+      <w:r>
+        <w:rPr>
+          <w:rFonts w:ascii="Arial" w:hAnsi="Arial" w:cs="Arial"/>
+          <w:position w:val="-12"/>
+          <w:sz w:val="24"/>
+          <w:szCs w:val="24"/>
+        </w:rPr>
+        <w:fldChar w:fldCharType="end"/>
+      </w:r>
     </w:p>
     <w:p>
       <w:pPr>
@@ -7706,8 +7889,53 @@
           <w:sz w:val="24"/>
           <w:szCs w:val="24"/>
         </w:rPr>
+        <w:fldChar w:fldCharType="begin"/>
+      </w:r>
+      <w:r>
+        <w:rPr>
+          <w:rFonts w:ascii="Arial" w:hAnsi="Arial" w:cs="Arial"/>
+          <w:position w:val="-6"/>
+          <w:sz w:val="24"/>
+          <w:szCs w:val="24"/>
+        </w:rPr>
+        <w:instrText xml:space="preserve"> </w:instrText>
+      </w:r>
+      <w:r>
+        <w:rPr>
+          <w:rFonts w:ascii="Arial" w:hAnsi="Arial" w:cs="Arial"/>
+          <w:position w:val="-6"/>
+          <w:sz w:val="24"/>
+          <w:szCs w:val="24"/>
+        </w:rPr>
+        <w:instrText>INCLUDEPICTURE  "https://d.docs.live.net/b067b7b029f5ae2b/Documents/Keyin_SD/Semester 3/Keyin-S3-SD16-Java/Previous/Advanced Programming Java/Spring 22/ICS101/ics101-002/Hw2_002.gif" \* MERGEFORMATINET</w:instrText>
+      </w:r>
+      <w:r>
+        <w:rPr>
+          <w:rFonts w:ascii="Arial" w:hAnsi="Arial" w:cs="Arial"/>
+          <w:position w:val="-6"/>
+          <w:sz w:val="24"/>
+          <w:szCs w:val="24"/>
+        </w:rPr>
+        <w:instrText xml:space="preserve"> </w:instrText>
+      </w:r>
+      <w:r>
+        <w:rPr>
+          <w:rFonts w:ascii="Arial" w:hAnsi="Arial" w:cs="Arial"/>
+          <w:position w:val="-6"/>
+          <w:sz w:val="24"/>
+          <w:szCs w:val="24"/>
+        </w:rPr>
+        <w:fldChar w:fldCharType="separate"/>
+      </w:r>
+      <w:r>
+        <w:rPr>
+          <w:rFonts w:ascii="Arial" w:hAnsi="Arial" w:cs="Arial"/>
+          <w:position w:val="-6"/>
+          <w:sz w:val="24"/>
+          <w:szCs w:val="24"/>
+        </w:rPr>
         <w:pict w14:anchorId="2626DB3F">
-          <v:shape id="_x0000_i1027" type="#_x0000_t75" style="width:130.25pt;height:14.4pt">
+          <v:shape id="_x0000_i1027" type="#_x0000_t75" style="width:130.4pt;height:14.25pt">
             <v:imagedata r:id="rId14" r:href="rId15"/>
           </v:shape>
         </w:pict>
@@ -7850,6 +8078,15 @@
       <w:r>
         <w:rPr>
           <w:rFonts w:ascii="Arial" w:hAnsi="Arial" w:cs="Arial"/>
+          <w:position w:val="-6"/>
+          <w:sz w:val="24"/>
+          <w:szCs w:val="24"/>
+        </w:rPr>
+        <w:fldChar w:fldCharType="end"/>
+      </w:r>
+      <w:r>
+        <w:rPr>
+          <w:rFonts w:ascii="Arial" w:hAnsi="Arial" w:cs="Arial"/>
           <w:sz w:val="24"/>
           <w:szCs w:val="24"/>
         </w:rPr>
@@ -8292,11 +8529,65 @@
           <w:sz w:val="24"/>
           <w:szCs w:val="24"/>
         </w:rPr>
+        <w:fldChar w:fldCharType="begin"/>
+      </w:r>
+      <w:r>
+        <w:rPr>
+          <w:rFonts w:ascii="Arial" w:hAnsi="Arial" w:cs="Arial"/>
+          <w:position w:val="-24"/>
+          <w:sz w:val="24"/>
+          <w:szCs w:val="24"/>
+        </w:rPr>
+        <w:instrText xml:space="preserve"> </w:instrText>
+      </w:r>
+      <w:r>
+        <w:rPr>
+          <w:rFonts w:ascii="Arial" w:hAnsi="Arial" w:cs="Arial"/>
+          <w:position w:val="-24"/>
+          <w:sz w:val="24"/>
+          <w:szCs w:val="24"/>
+        </w:rPr>
+        <w:instrText>INCLUDEPICTURE  "https://d.docs.live.net/b067b7b029f5ae2b/Documents/Keyin_SD/Semester 3/Keyin-S3-SD16-Java/Previous/Advanced Programming Java/Spring 22/ICS101/ics101-002/Hw2_003.gif" \* MERGEFORMATINET</w:instrText>
+      </w:r>
+      <w:r>
+        <w:rPr>
+          <w:rFonts w:ascii="Arial" w:hAnsi="Arial" w:cs="Arial"/>
+          <w:position w:val="-24"/>
+          <w:sz w:val="24"/>
+          <w:szCs w:val="24"/>
+        </w:rPr>
+        <w:instrText xml:space="preserve"> </w:instrText>
+      </w:r>
+      <w:r>
+        <w:rPr>
+          <w:rFonts w:ascii="Arial" w:hAnsi="Arial" w:cs="Arial"/>
+          <w:position w:val="-24"/>
+          <w:sz w:val="24"/>
+          <w:szCs w:val="24"/>
+        </w:rPr>
+        <w:fldChar w:fldCharType="separate"/>
+      </w:r>
+      <w:r>
+        <w:rPr>
+          <w:rFonts w:ascii="Arial" w:hAnsi="Arial" w:cs="Arial"/>
+          <w:position w:val="-24"/>
+          <w:sz w:val="24"/>
+          <w:szCs w:val="24"/>
+        </w:rPr>
         <w:pict w14:anchorId="3BB5C2F3">
-          <v:shape id="_x0000_i1028" type="#_x0000_t75" style="width:73.25pt;height:31.3pt">
+          <v:shape id="_x0000_i1028" type="#_x0000_t75" style="width:73.35pt;height:31.25pt">
             <v:imagedata r:id="rId16" r:href="rId17"/>
           </v:shape>
         </w:pict>
+      </w:r>
+      <w:r>
+        <w:rPr>
+          <w:rFonts w:ascii="Arial" w:hAnsi="Arial" w:cs="Arial"/>
+          <w:position w:val="-24"/>
+          <w:sz w:val="24"/>
+          <w:szCs w:val="24"/>
+        </w:rPr>
+        <w:fldChar w:fldCharType="end"/>
       </w:r>
       <w:r>
         <w:rPr>
@@ -14457,6 +14748,23 @@
 </file>
 
 <file path=customXml/item1.xml><?xml version="1.0" encoding="utf-8"?>
+<?mso-contentType ?>
+<FormTemplates xmlns="http://schemas.microsoft.com/sharepoint/v3/contenttype/forms">
+  <Display>DocumentLibraryForm</Display>
+  <Edit>DocumentLibraryForm</Edit>
+  <New>DocumentLibraryForm</New>
+</FormTemplates>
+</file>
+
+<file path=customXml/item2.xml><?xml version="1.0" encoding="utf-8"?>
+<p:properties xmlns:p="http://schemas.microsoft.com/office/2006/metadata/properties" xmlns:xsi="http://www.w3.org/2001/XMLSchema-instance" xmlns:pc="http://schemas.microsoft.com/office/infopath/2007/PartnerControls">
+  <documentManagement>
+    <ReferenceId xmlns="5219ddad-41f4-4976-96f9-2ab705d96301" xsi:nil="true"/>
+  </documentManagement>
+</p:properties>
+</file>
+
+<file path=customXml/item3.xml><?xml version="1.0" encoding="utf-8"?>
 <ct:contentTypeSchema xmlns:ct="http://schemas.microsoft.com/office/2006/metadata/contentType" xmlns:ma="http://schemas.microsoft.com/office/2006/metadata/properties/metaAttributes" ct:_="" ma:_="" ma:contentTypeName="Document" ma:contentTypeID="0x010100460550725B55BF499099A080E992560E" ma:contentTypeVersion="4" ma:contentTypeDescription="Create a new document." ma:contentTypeScope="" ma:versionID="23f7de7cd673a417193ed4cee866663c">
   <xsd:schema xmlns:xsd="http://www.w3.org/2001/XMLSchema" xmlns:xs="http://www.w3.org/2001/XMLSchema" xmlns:p="http://schemas.microsoft.com/office/2006/metadata/properties" xmlns:ns2="5219ddad-41f4-4976-96f9-2ab705d96301" targetNamespace="http://schemas.microsoft.com/office/2006/metadata/properties" ma:root="true" ma:fieldsID="8948c37f7b587b0315d18231023a8586" ns2:_="">
     <xsd:import namespace="5219ddad-41f4-4976-96f9-2ab705d96301"/>
@@ -14600,24 +14908,25 @@
 </ct:contentTypeSchema>
 </file>
 
-<file path=customXml/item2.xml><?xml version="1.0" encoding="utf-8"?>
-<p:properties xmlns:p="http://schemas.microsoft.com/office/2006/metadata/properties" xmlns:xsi="http://www.w3.org/2001/XMLSchema-instance" xmlns:pc="http://schemas.microsoft.com/office/infopath/2007/PartnerControls">
-  <documentManagement>
-    <ReferenceId xmlns="5219ddad-41f4-4976-96f9-2ab705d96301" xsi:nil="true"/>
-  </documentManagement>
-</p:properties>
+<file path=customXml/itemProps1.xml><?xml version="1.0" encoding="utf-8"?>
+<ds:datastoreItem xmlns:ds="http://schemas.openxmlformats.org/officeDocument/2006/customXml" ds:itemID="{20A2F896-B240-492A-90A3-C49AD5823D53}">
+  <ds:schemaRefs>
+    <ds:schemaRef ds:uri="http://schemas.microsoft.com/sharepoint/v3/contenttype/forms"/>
+  </ds:schemaRefs>
+</ds:datastoreItem>
 </file>
 
-<file path=customXml/item3.xml><?xml version="1.0" encoding="utf-8"?>
-<?mso-contentType ?>
-<FormTemplates xmlns="http://schemas.microsoft.com/sharepoint/v3/contenttype/forms">
-  <Display>DocumentLibraryForm</Display>
-  <Edit>DocumentLibraryForm</Edit>
-  <New>DocumentLibraryForm</New>
-</FormTemplates>
+<file path=customXml/itemProps2.xml><?xml version="1.0" encoding="utf-8"?>
+<ds:datastoreItem xmlns:ds="http://schemas.openxmlformats.org/officeDocument/2006/customXml" ds:itemID="{E5CC7C6A-19C2-44ED-ACC8-510A4B714969}">
+  <ds:schemaRefs>
+    <ds:schemaRef ds:uri="http://schemas.microsoft.com/office/2006/metadata/properties"/>
+    <ds:schemaRef ds:uri="http://schemas.microsoft.com/office/infopath/2007/PartnerControls"/>
+    <ds:schemaRef ds:uri="5219ddad-41f4-4976-96f9-2ab705d96301"/>
+  </ds:schemaRefs>
+</ds:datastoreItem>
 </file>
 
-<file path=customXml/itemProps1.xml><?xml version="1.0" encoding="utf-8"?>
+<file path=customXml/itemProps3.xml><?xml version="1.0" encoding="utf-8"?>
 <ds:datastoreItem xmlns:ds="http://schemas.openxmlformats.org/officeDocument/2006/customXml" ds:itemID="{186F9743-F957-4389-A58A-7617EB3ADB75}">
   <ds:schemaRefs>
     <ds:schemaRef ds:uri="http://schemas.microsoft.com/office/2006/metadata/contentType"/>
@@ -14633,22 +14942,4 @@
     <ds:schemaRef ds:uri="http://schemas.microsoft.com/internal/obd"/>
   </ds:schemaRefs>
 </ds:datastoreItem>
-</file>
-
-<file path=customXml/itemProps2.xml><?xml version="1.0" encoding="utf-8"?>
-<ds:datastoreItem xmlns:ds="http://schemas.openxmlformats.org/officeDocument/2006/customXml" ds:itemID="{E5CC7C6A-19C2-44ED-ACC8-510A4B714969}">
-  <ds:schemaRefs>
-    <ds:schemaRef ds:uri="http://schemas.microsoft.com/office/2006/metadata/properties"/>
-    <ds:schemaRef ds:uri="http://schemas.microsoft.com/office/infopath/2007/PartnerControls"/>
-    <ds:schemaRef ds:uri="5219ddad-41f4-4976-96f9-2ab705d96301"/>
-  </ds:schemaRefs>
-</ds:datastoreItem>
-</file>
-
-<file path=customXml/itemProps3.xml><?xml version="1.0" encoding="utf-8"?>
-<ds:datastoreItem xmlns:ds="http://schemas.openxmlformats.org/officeDocument/2006/customXml" ds:itemID="{20A2F896-B240-492A-90A3-C49AD5823D53}">
-  <ds:schemaRefs>
-    <ds:schemaRef ds:uri="http://schemas.microsoft.com/sharepoint/v3/contenttype/forms"/>
-  </ds:schemaRefs>
-</ds:datastoreItem>
 </file>
</xml_diff>